<commit_message>
Co-authored-by: ZYUXI22 <ZYUXI22@users.noreply.github.com> Co-authored-by: Hajrah143 <Hajrah143@users.noreply.github.com>
</commit_message>
<xml_diff>
--- a/Docs/DCITP1A04_Group4_Zach_reflection.docx
+++ b/Docs/DCITP1A04_Group4_Zach_reflection.docx
@@ -174,7 +174,6 @@
       <w:r>
         <w:tab/>
       </w:r>
-      <w:proofErr w:type="gramStart"/>
       <w:r>
         <w:rPr>
           <w:b/>
@@ -194,15 +193,7 @@
           <w:b/>
           <w:bCs/>
         </w:rPr>
-        <w:t>No</w:t>
-      </w:r>
-      <w:proofErr w:type="gramEnd"/>
-      <w:r>
-        <w:rPr>
-          <w:b/>
-          <w:bCs/>
-        </w:rPr>
-        <w:t>:</w:t>
+        <w:t>No:</w:t>
       </w:r>
       <w:r>
         <w:rPr>
@@ -310,23 +301,7 @@
           <w:i/>
           <w:iCs/>
         </w:rPr>
-        <w:t xml:space="preserve">critically </w:t>
-      </w:r>
-      <w:proofErr w:type="spellStart"/>
-      <w:r>
-        <w:rPr>
-          <w:i/>
-          <w:iCs/>
-        </w:rPr>
-        <w:t>analyze</w:t>
-      </w:r>
-      <w:proofErr w:type="spellEnd"/>
-      <w:r>
-        <w:rPr>
-          <w:i/>
-          <w:iCs/>
-        </w:rPr>
-        <w:t xml:space="preserve"> your CA2 project decisions, technical issues, and your responsible use of AI tools. </w:t>
+        <w:t xml:space="preserve">critically analyze your CA2 project decisions, technical issues, and your responsible use of AI tools. </w:t>
       </w:r>
       <w:r>
         <w:rPr>
@@ -563,17 +538,8 @@
           <w:i/>
           <w:iCs/>
         </w:rPr>
-        <w:t xml:space="preserve"> </w:t>
-      </w:r>
-      <w:proofErr w:type="spellStart"/>
-      <w:r>
-        <w:rPr>
-          <w:i/>
-          <w:iCs/>
-        </w:rPr>
-        <w:t>BrightSpace</w:t>
-      </w:r>
-      <w:proofErr w:type="spellEnd"/>
+        <w:t xml:space="preserve"> BrightSpace</w:t>
+      </w:r>
       <w:r>
         <w:rPr>
           <w:i/>
@@ -617,23 +583,7 @@
           <w:i/>
           <w:iCs/>
         </w:rPr>
-        <w:t xml:space="preserve"> (available in </w:t>
-      </w:r>
-      <w:proofErr w:type="spellStart"/>
-      <w:r>
-        <w:rPr>
-          <w:i/>
-          <w:iCs/>
-        </w:rPr>
-        <w:t>BrightSpace</w:t>
-      </w:r>
-      <w:proofErr w:type="spellEnd"/>
-      <w:r>
-        <w:rPr>
-          <w:i/>
-          <w:iCs/>
-        </w:rPr>
-        <w:t>)</w:t>
+        <w:t xml:space="preserve"> (available in BrightSpace)</w:t>
       </w:r>
       <w:r>
         <w:rPr>
@@ -805,33 +755,7 @@
           <w:lang w:eastAsia="zh-CN"/>
           <w14:ligatures w14:val="none"/>
         </w:rPr>
-        <w:t xml:space="preserve">what impact do they cause </w:t>
-      </w:r>
-      <w:proofErr w:type="spellStart"/>
-      <w:r>
-        <w:rPr>
-          <w:rFonts w:eastAsia="Times New Roman" w:cs="Arial"/>
-          <w:i/>
-          <w:iCs/>
-          <w:color w:val="0070C0"/>
-          <w:kern w:val="0"/>
-          <w:lang w:eastAsia="zh-CN"/>
-          <w14:ligatures w14:val="none"/>
-        </w:rPr>
-        <w:t>e.g</w:t>
-      </w:r>
-      <w:proofErr w:type="spellEnd"/>
-      <w:r>
-        <w:rPr>
-          <w:rFonts w:eastAsia="Times New Roman" w:cs="Arial"/>
-          <w:i/>
-          <w:iCs/>
-          <w:color w:val="0070C0"/>
-          <w:kern w:val="0"/>
-          <w:lang w:eastAsia="zh-CN"/>
-          <w14:ligatures w14:val="none"/>
-        </w:rPr>
-        <w:t xml:space="preserve"> on</w:t>
+        <w:t>what impact do they cause e.g on</w:t>
       </w:r>
       <w:r>
         <w:rPr>
@@ -897,7 +821,6 @@
           <w:color w:val="0070C0"/>
         </w:rPr>
       </w:pPr>
-      <w:proofErr w:type="spellStart"/>
       <w:r>
         <w:rPr>
           <w:i/>
@@ -916,20 +839,7 @@
           <w:lang w:eastAsia="zh-CN"/>
           <w14:ligatures w14:val="none"/>
         </w:rPr>
-        <w:t>nalyze</w:t>
-      </w:r>
-      <w:proofErr w:type="spellEnd"/>
-      <w:r>
-        <w:rPr>
-          <w:rFonts w:eastAsia="Times New Roman" w:cs="Arial"/>
-          <w:i/>
-          <w:iCs/>
-          <w:color w:val="0070C0"/>
-          <w:kern w:val="0"/>
-          <w:lang w:eastAsia="zh-CN"/>
-          <w14:ligatures w14:val="none"/>
-        </w:rPr>
-        <w:t xml:space="preserve"> the trade-offs between using a front-end styling framework (e.g., Bootstrap/Tailwind) and writing custom CSS in your project. How did your choice affect the efficiency, design flexibility, or maintainability of your website?</w:t>
+        <w:t>nalyze the trade-offs between using a front-end styling framework (e.g., Bootstrap/Tailwind) and writing custom CSS in your project. How did your choice affect the efficiency, design flexibility, or maintainability of your website?</w:t>
       </w:r>
     </w:p>
     <w:p>
@@ -1080,15 +990,7 @@
               </w:rPr>
             </w:pPr>
             <w:r>
-              <w:t xml:space="preserve">The biggest change to our original plan was to reorganise the website from 12 different html pages into four main categories: Home, About, Workout, and Fitness Activity. The website structure has been changed to be more organised and easier for users to navigate. It brings together related pages instead of giving users too many separate navigation options, for a clearer and more manageable user experience. It also provides the site with a more cohesive </w:t>
-            </w:r>
-            <w:proofErr w:type="gramStart"/>
-            <w:r>
-              <w:t>feel, and</w:t>
-            </w:r>
-            <w:proofErr w:type="gramEnd"/>
-            <w:r>
-              <w:t xml:space="preserve"> makes it easier to navigate.</w:t>
+              <w:t>The biggest change to our original plan was to reorganise the website from 12 different html pages into four main categories: Home, About, Workout, and Fitness Activity. The website structure has been changed to be more organised and easier for users to navigate. It brings together related pages instead of giving users too many separate navigation options, for a clearer and more manageable user experience. It also provides the site with a more cohesive feel, and makes it easier to navigate.</w:t>
             </w:r>
             <w:r>
               <w:br/>
@@ -1104,49 +1006,7 @@
               <w:rPr>
                 <w:lang w:val="en-US"/>
               </w:rPr>
-              <w:t xml:space="preserve">Another big change was more interactive features. The Workout section includes an interactive schedule table with checkboxes to mark completion and a “Print Schedule” button for a 7-day schedule. Users can create, update, </w:t>
-            </w:r>
-            <w:proofErr w:type="spellStart"/>
-            <w:r>
-              <w:rPr>
-                <w:lang w:val="en-US"/>
-              </w:rPr>
-              <w:t>customise</w:t>
-            </w:r>
-            <w:proofErr w:type="spellEnd"/>
-            <w:r>
-              <w:rPr>
-                <w:lang w:val="en-US"/>
-              </w:rPr>
-              <w:t xml:space="preserve"> and reset their weekly workout schedule. Each workout page also features a quiz, which helps keep the content engaging and allows users to test their understanding. The Fitness Activity page was further expanded to a gamified fitness challenge using JavaScript where users earn XP by completing healthy activities. </w:t>
-            </w:r>
-            <w:proofErr w:type="gramStart"/>
-            <w:r>
-              <w:rPr>
-                <w:lang w:val="en-US"/>
-              </w:rPr>
-              <w:t>you</w:t>
-            </w:r>
-            <w:proofErr w:type="gramEnd"/>
-            <w:r>
-              <w:rPr>
-                <w:lang w:val="en-US"/>
-              </w:rPr>
-              <w:t xml:space="preserve"> might trade some XP for </w:t>
-            </w:r>
-            <w:proofErr w:type="spellStart"/>
-            <w:r>
-              <w:rPr>
-                <w:lang w:val="en-US"/>
-              </w:rPr>
-              <w:t>FitPoly</w:t>
-            </w:r>
-            <w:proofErr w:type="spellEnd"/>
-            <w:r>
-              <w:rPr>
-                <w:lang w:val="en-US"/>
-              </w:rPr>
-              <w:t xml:space="preserve"> Points and possibly get rewards like discounts at campus dining or milestone certificates. These changes encourage active use by providing a more rewarding experience.</w:t>
+              <w:t>Another big change was more interactive features. The Workout section includes an interactive schedule table with checkboxes to mark completion and a “Print Schedule” button for a 7-day schedule. Users can create, update, customise and reset their weekly workout schedule. Each workout page also features a quiz, which helps keep the content engaging and allows users to test their understanding. The Fitness Activity page was further expanded to a gamified fitness challenge using JavaScript where users earn XP by completing healthy activities. you might trade some XP for FitPoly Points and possibly get rewards like discounts at campus dining or milestone certificates. These changes encourage active use by providing a more rewarding experience.</w:t>
             </w:r>
           </w:p>
           <w:p>
@@ -1178,63 +1038,7 @@
               <w:rPr>
                 <w:lang w:val="en-US"/>
               </w:rPr>
-              <w:t xml:space="preserve">I would have used a front-end framework like Bootstrap to speed up the development process. Bootstrap provides pre-built components and responsive grid layouts. But the team would have more freedom to </w:t>
-            </w:r>
-            <w:proofErr w:type="spellStart"/>
-            <w:r>
-              <w:rPr>
-                <w:lang w:val="en-US"/>
-              </w:rPr>
-              <w:t>customise</w:t>
-            </w:r>
-            <w:proofErr w:type="spellEnd"/>
-            <w:r>
-              <w:rPr>
-                <w:lang w:val="en-US"/>
-              </w:rPr>
-              <w:t xml:space="preserve"> the look and feel of the </w:t>
-            </w:r>
-            <w:proofErr w:type="gramStart"/>
-            <w:r>
-              <w:rPr>
-                <w:lang w:val="en-US"/>
-              </w:rPr>
-              <w:t>website, and</w:t>
-            </w:r>
-            <w:proofErr w:type="gramEnd"/>
-            <w:r>
-              <w:rPr>
-                <w:lang w:val="en-US"/>
-              </w:rPr>
-              <w:t xml:space="preserve"> could make it more distinctive using custom CSS. I didn't have to do the </w:t>
-            </w:r>
-            <w:proofErr w:type="gramStart"/>
-            <w:r>
-              <w:rPr>
-                <w:lang w:val="en-US"/>
-              </w:rPr>
-              <w:t>CSS</w:t>
-            </w:r>
-            <w:proofErr w:type="gramEnd"/>
-            <w:r>
-              <w:rPr>
-                <w:lang w:val="en-US"/>
-              </w:rPr>
-              <w:t xml:space="preserve"> so I mostly worked on the structure and making the site interactive. In conclusion, our design choices resulted in a more </w:t>
-            </w:r>
-            <w:proofErr w:type="spellStart"/>
-            <w:r>
-              <w:rPr>
-                <w:lang w:val="en-US"/>
-              </w:rPr>
-              <w:t>personalised</w:t>
-            </w:r>
-            <w:proofErr w:type="spellEnd"/>
-            <w:r>
-              <w:rPr>
-                <w:lang w:val="en-US"/>
-              </w:rPr>
-              <w:t>, interactive website, but the complexity of JavaScript made the project more difficult to build and maintain.</w:t>
+              <w:t>I would have used a front-end framework like Bootstrap to speed up the development process. Bootstrap provides pre-built components and responsive grid layouts. But the team would have more freedom to customise the look and feel of the website, and could make it more distinctive using custom CSS. I didn't have to do the CSS so I mostly worked on the structure and making the site interactive. In conclusion, our design choices resulted in a more personalised, interactive website, but the complexity of JavaScript made the project more difficult to build and maintain.</w:t>
             </w:r>
           </w:p>
           <w:p>
@@ -1417,33 +1221,7 @@
           <w:lang w:eastAsia="zh-CN"/>
           <w14:ligatures w14:val="none"/>
         </w:rPr>
-        <w:t xml:space="preserve">what impact do they cause </w:t>
-      </w:r>
-      <w:proofErr w:type="spellStart"/>
-      <w:r>
-        <w:rPr>
-          <w:rFonts w:eastAsia="Times New Roman" w:cs="Arial"/>
-          <w:i/>
-          <w:iCs/>
-          <w:color w:val="0070C0"/>
-          <w:kern w:val="0"/>
-          <w:lang w:eastAsia="zh-CN"/>
-          <w14:ligatures w14:val="none"/>
-        </w:rPr>
-        <w:t>e.g</w:t>
-      </w:r>
-      <w:proofErr w:type="spellEnd"/>
-      <w:r>
-        <w:rPr>
-          <w:rFonts w:eastAsia="Times New Roman" w:cs="Arial"/>
-          <w:i/>
-          <w:iCs/>
-          <w:color w:val="0070C0"/>
-          <w:kern w:val="0"/>
-          <w:lang w:eastAsia="zh-CN"/>
-          <w14:ligatures w14:val="none"/>
-        </w:rPr>
-        <w:t xml:space="preserve"> on</w:t>
+        <w:t>what impact do they cause e.g on</w:t>
       </w:r>
       <w:r>
         <w:rPr>
@@ -1852,23 +1630,13 @@
           <w:color w:val="0070C0"/>
         </w:rPr>
       </w:pPr>
-      <w:proofErr w:type="spellStart"/>
       <w:r>
         <w:rPr>
           <w:i/>
           <w:iCs/>
           <w:color w:val="0070C0"/>
         </w:rPr>
-        <w:t>Analyze</w:t>
-      </w:r>
-      <w:proofErr w:type="spellEnd"/>
-      <w:r>
-        <w:rPr>
-          <w:i/>
-          <w:iCs/>
-          <w:color w:val="0070C0"/>
-        </w:rPr>
-        <w:t xml:space="preserve"> your use of AI during this project: Which specific problem or task did AI help you with, and why did you choose to use AI for it?</w:t>
+        <w:t>Analyze your use of AI during this project: Which specific problem or task did AI help you with, and why did you choose to use AI for it?</w:t>
       </w:r>
     </w:p>
     <w:p>
@@ -1911,7 +1679,7 @@
         <w:tblLook w:val="04A0" w:firstRow="1" w:lastRow="0" w:firstColumn="1" w:lastColumn="0" w:noHBand="0" w:noVBand="1"/>
       </w:tblPr>
       <w:tblGrid>
-        <w:gridCol w:w="8930"/>
+        <w:gridCol w:w="9246"/>
       </w:tblGrid>
       <w:tr>
         <w:tc>
@@ -2020,6 +1788,48 @@
                 <w:bCs/>
               </w:rPr>
             </w:pPr>
+            <w:r>
+              <w:rPr>
+                <w:b/>
+                <w:bCs/>
+              </w:rPr>
+              <w:lastRenderedPageBreak/>
+              <w:drawing>
+                <wp:inline distT="0" distB="0" distL="0" distR="0" wp14:anchorId="02DEE8F7" wp14:editId="3C9C04D4">
+                  <wp:extent cx="5731510" cy="2707640"/>
+                  <wp:effectExtent l="0" t="0" r="2540" b="0"/>
+                  <wp:docPr id="690088559" name="Picture 1"/>
+                  <wp:cNvGraphicFramePr>
+                    <a:graphicFrameLocks xmlns:a="http://schemas.openxmlformats.org/drawingml/2006/main" noChangeAspect="1"/>
+                  </wp:cNvGraphicFramePr>
+                  <a:graphic xmlns:a="http://schemas.openxmlformats.org/drawingml/2006/main">
+                    <a:graphicData uri="http://schemas.openxmlformats.org/drawingml/2006/picture">
+                      <pic:pic xmlns:pic="http://schemas.openxmlformats.org/drawingml/2006/picture">
+                        <pic:nvPicPr>
+                          <pic:cNvPr id="690088559" name=""/>
+                          <pic:cNvPicPr/>
+                        </pic:nvPicPr>
+                        <pic:blipFill>
+                          <a:blip r:embed="rId10"/>
+                          <a:stretch>
+                            <a:fillRect/>
+                          </a:stretch>
+                        </pic:blipFill>
+                        <pic:spPr>
+                          <a:xfrm>
+                            <a:off x="0" y="0"/>
+                            <a:ext cx="5731510" cy="2707640"/>
+                          </a:xfrm>
+                          <a:prstGeom prst="rect">
+                            <a:avLst/>
+                          </a:prstGeom>
+                        </pic:spPr>
+                      </pic:pic>
+                    </a:graphicData>
+                  </a:graphic>
+                </wp:inline>
+              </w:drawing>
+            </w:r>
           </w:p>
           <w:p>
             <w:pPr>
@@ -2164,23 +1974,7 @@
           <w:i/>
           <w:iCs/>
         </w:rPr>
-        <w:t>(</w:t>
-      </w:r>
-      <w:proofErr w:type="spellStart"/>
-      <w:r>
-        <w:rPr>
-          <w:i/>
-          <w:iCs/>
-        </w:rPr>
-        <w:t>e.g</w:t>
-      </w:r>
-      <w:proofErr w:type="spellEnd"/>
-      <w:r>
-        <w:rPr>
-          <w:i/>
-          <w:iCs/>
-        </w:rPr>
-        <w:t xml:space="preserve"> AI outputs or evidence</w:t>
+        <w:t>(e.g AI outputs or evidence</w:t>
       </w:r>
       <w:r>
         <w:rPr>
@@ -2238,10 +2032,10 @@
       </w:r>
     </w:p>
     <w:sectPr>
-      <w:headerReference w:type="even" r:id="rId10"/>
-      <w:headerReference w:type="default" r:id="rId11"/>
-      <w:footerReference w:type="default" r:id="rId12"/>
-      <w:headerReference w:type="first" r:id="rId13"/>
+      <w:headerReference w:type="even" r:id="rId11"/>
+      <w:headerReference w:type="default" r:id="rId12"/>
+      <w:footerReference w:type="default" r:id="rId13"/>
+      <w:headerReference w:type="first" r:id="rId14"/>
       <w:type w:val="continuous"/>
       <w:pgSz w:w="11906" w:h="16838"/>
       <w:pgMar w:top="1440" w:right="1440" w:bottom="568" w:left="1440" w:header="708" w:footer="227" w:gutter="0"/>
@@ -7308,6 +7102,7 @@
   <w:style w:type="character" w:default="1" w:styleId="DefaultParagraphFont">
     <w:name w:val="Default Paragraph Font"/>
     <w:uiPriority w:val="1"/>
+    <w:semiHidden/>
     <w:unhideWhenUsed/>
   </w:style>
   <w:style w:type="table" w:default="1" w:styleId="TableNormal">
@@ -8048,6 +7843,28 @@
 </file>
 
 <file path=customXml/item1.xml><?xml version="1.0" encoding="utf-8"?>
+<p:properties xmlns:p="http://schemas.microsoft.com/office/2006/metadata/properties" xmlns:xsi="http://www.w3.org/2001/XMLSchema-instance" xmlns:pc="http://schemas.microsoft.com/office/infopath/2007/PartnerControls">
+  <documentManagement>
+    <_ip_UnifiedCompliancePolicyUIAction xmlns="http://schemas.microsoft.com/sharepoint/v3" xsi:nil="true"/>
+    <lcf76f155ced4ddcb4097134ff3c332f xmlns="b7fad248-bdcd-4271-9916-809a465982f7">
+      <Terms xmlns="http://schemas.microsoft.com/office/infopath/2007/PartnerControls"/>
+    </lcf76f155ced4ddcb4097134ff3c332f>
+    <_ip_UnifiedCompliancePolicyProperties xmlns="http://schemas.microsoft.com/sharepoint/v3" xsi:nil="true"/>
+    <TaxCatchAll xmlns="02435ef8-874b-49fb-b034-023fbc1b0e17" xsi:nil="true"/>
+  </documentManagement>
+</p:properties>
+</file>
+
+<file path=customXml/item2.xml><?xml version="1.0" encoding="utf-8"?>
+<?mso-contentType ?>
+<FormTemplates xmlns="http://schemas.microsoft.com/sharepoint/v3/contenttype/forms">
+  <Display>DocumentLibraryForm</Display>
+  <Edit>DocumentLibraryForm</Edit>
+  <New>DocumentLibraryForm</New>
+</FormTemplates>
+</file>
+
+<file path=customXml/item3.xml><?xml version="1.0" encoding="utf-8"?>
 <ct:contentTypeSchema xmlns:ct="http://schemas.microsoft.com/office/2006/metadata/contentType" xmlns:ma="http://schemas.microsoft.com/office/2006/metadata/properties/metaAttributes" ct:_="" ma:_="" ma:contentTypeName="Document" ma:contentTypeID="0x01010095B83DA6990E41418BCDB3837731DDD9" ma:contentTypeVersion="12" ma:contentTypeDescription="Create a new document." ma:contentTypeScope="" ma:versionID="9a0e40b26489cf95b92c0935470f1e05">
   <xsd:schema xmlns:xsd="http://www.w3.org/2001/XMLSchema" xmlns:xs="http://www.w3.org/2001/XMLSchema" xmlns:p="http://schemas.microsoft.com/office/2006/metadata/properties" xmlns:ns1="http://schemas.microsoft.com/sharepoint/v3" xmlns:ns2="b7fad248-bdcd-4271-9916-809a465982f7" xmlns:ns3="02435ef8-874b-49fb-b034-023fbc1b0e17" targetNamespace="http://schemas.microsoft.com/office/2006/metadata/properties" ma:root="true" ma:fieldsID="f5cd93c5e221519b9b0b4981d98a568c" ns1:_="" ns2:_="" ns3:_="">
     <xsd:import namespace="http://schemas.microsoft.com/sharepoint/v3"/>
@@ -8253,29 +8070,27 @@
 </ct:contentTypeSchema>
 </file>
 
-<file path=customXml/item2.xml><?xml version="1.0" encoding="utf-8"?>
-<?mso-contentType ?>
-<FormTemplates xmlns="http://schemas.microsoft.com/sharepoint/v3/contenttype/forms">
-  <Display>DocumentLibraryForm</Display>
-  <Edit>DocumentLibraryForm</Edit>
-  <New>DocumentLibraryForm</New>
-</FormTemplates>
+<file path=customXml/itemProps1.xml><?xml version="1.0" encoding="utf-8"?>
+<ds:datastoreItem xmlns:ds="http://schemas.openxmlformats.org/officeDocument/2006/customXml" ds:itemID="{451C2406-06F5-4301-9967-C40BCABE7AD8}">
+  <ds:schemaRefs>
+    <ds:schemaRef ds:uri="http://schemas.microsoft.com/office/2006/metadata/properties"/>
+    <ds:schemaRef ds:uri="http://schemas.microsoft.com/office/infopath/2007/PartnerControls"/>
+    <ds:schemaRef ds:uri="http://schemas.microsoft.com/sharepoint/v3"/>
+    <ds:schemaRef ds:uri="b7fad248-bdcd-4271-9916-809a465982f7"/>
+    <ds:schemaRef ds:uri="02435ef8-874b-49fb-b034-023fbc1b0e17"/>
+  </ds:schemaRefs>
+</ds:datastoreItem>
 </file>
 
-<file path=customXml/item3.xml><?xml version="1.0" encoding="utf-8"?>
-<p:properties xmlns:p="http://schemas.microsoft.com/office/2006/metadata/properties" xmlns:xsi="http://www.w3.org/2001/XMLSchema-instance" xmlns:pc="http://schemas.microsoft.com/office/infopath/2007/PartnerControls">
-  <documentManagement>
-    <_ip_UnifiedCompliancePolicyUIAction xmlns="http://schemas.microsoft.com/sharepoint/v3" xsi:nil="true"/>
-    <lcf76f155ced4ddcb4097134ff3c332f xmlns="b7fad248-bdcd-4271-9916-809a465982f7">
-      <Terms xmlns="http://schemas.microsoft.com/office/infopath/2007/PartnerControls"/>
-    </lcf76f155ced4ddcb4097134ff3c332f>
-    <_ip_UnifiedCompliancePolicyProperties xmlns="http://schemas.microsoft.com/sharepoint/v3" xsi:nil="true"/>
-    <TaxCatchAll xmlns="02435ef8-874b-49fb-b034-023fbc1b0e17" xsi:nil="true"/>
-  </documentManagement>
-</p:properties>
+<file path=customXml/itemProps2.xml><?xml version="1.0" encoding="utf-8"?>
+<ds:datastoreItem xmlns:ds="http://schemas.openxmlformats.org/officeDocument/2006/customXml" ds:itemID="{891417BF-93F5-4F68-A276-BE80032FE8B6}">
+  <ds:schemaRefs>
+    <ds:schemaRef ds:uri="http://schemas.microsoft.com/sharepoint/v3/contenttype/forms"/>
+  </ds:schemaRefs>
+</ds:datastoreItem>
 </file>
 
-<file path=customXml/itemProps1.xml><?xml version="1.0" encoding="utf-8"?>
+<file path=customXml/itemProps3.xml><?xml version="1.0" encoding="utf-8"?>
 <ds:datastoreItem xmlns:ds="http://schemas.openxmlformats.org/officeDocument/2006/customXml" ds:itemID="{C936C116-FB31-4FEA-9B17-D53394B2065A}">
   <ds:schemaRefs>
     <ds:schemaRef ds:uri="http://schemas.microsoft.com/office/2006/metadata/contentType"/>
@@ -8293,24 +8108,4 @@
     <ds:schemaRef ds:uri="http://schemas.microsoft.com/internal/obd"/>
   </ds:schemaRefs>
 </ds:datastoreItem>
-</file>
-
-<file path=customXml/itemProps2.xml><?xml version="1.0" encoding="utf-8"?>
-<ds:datastoreItem xmlns:ds="http://schemas.openxmlformats.org/officeDocument/2006/customXml" ds:itemID="{891417BF-93F5-4F68-A276-BE80032FE8B6}">
-  <ds:schemaRefs>
-    <ds:schemaRef ds:uri="http://schemas.microsoft.com/sharepoint/v3/contenttype/forms"/>
-  </ds:schemaRefs>
-</ds:datastoreItem>
-</file>
-
-<file path=customXml/itemProps3.xml><?xml version="1.0" encoding="utf-8"?>
-<ds:datastoreItem xmlns:ds="http://schemas.openxmlformats.org/officeDocument/2006/customXml" ds:itemID="{451C2406-06F5-4301-9967-C40BCABE7AD8}">
-  <ds:schemaRefs>
-    <ds:schemaRef ds:uri="http://schemas.microsoft.com/office/2006/metadata/properties"/>
-    <ds:schemaRef ds:uri="http://schemas.microsoft.com/office/infopath/2007/PartnerControls"/>
-    <ds:schemaRef ds:uri="http://schemas.microsoft.com/sharepoint/v3"/>
-    <ds:schemaRef ds:uri="b7fad248-bdcd-4271-9916-809a465982f7"/>
-    <ds:schemaRef ds:uri="02435ef8-874b-49fb-b034-023fbc1b0e17"/>
-  </ds:schemaRefs>
-</ds:datastoreItem>
 </file>
</xml_diff>